<commit_message>
creación de batch para organizar los objetivos de aprendizaje de tercero.
</commit_message>
<xml_diff>
--- a/clases_2025_1/1_documentos_actas/2_Formato Acta de inicio cursos práctica 2025-1.docx
+++ b/clases_2025_1/1_documentos_actas/2_Formato Acta de inicio cursos práctica 2025-1.docx
@@ -2488,10 +2488,10 @@
       </w:tblPr>
       <w:tblGrid>
         <w:gridCol w:w="2710"/>
-        <w:gridCol w:w="1110"/>
+        <w:gridCol w:w="1416"/>
         <w:gridCol w:w="1203"/>
-        <w:gridCol w:w="3145"/>
-        <w:gridCol w:w="908"/>
+        <w:gridCol w:w="2371"/>
+        <w:gridCol w:w="1376"/>
       </w:tblGrid>
       <w:tr>
         <w:trPr>
@@ -2700,6 +2700,15 @@
                 <w:lang w:val="es-MX"/>
               </w:rPr>
             </w:pPr>
+            <w:r>
+              <w:rPr>
+                <w:rFonts w:ascii="Times New Roman" w:hAnsi="Times New Roman" w:cs="Times New Roman"/>
+                <w:sz w:val="24"/>
+                <w:szCs w:val="24"/>
+                <w:lang w:val="es-MX"/>
+              </w:rPr>
+              <w:t>6045248203</w:t>
+            </w:r>
           </w:p>
         </w:tc>
         <w:tc>
@@ -2717,6 +2726,15 @@
                 <w:lang w:val="es-MX"/>
               </w:rPr>
             </w:pPr>
+            <w:r>
+              <w:rPr>
+                <w:rFonts w:ascii="Times New Roman" w:hAnsi="Times New Roman" w:cs="Times New Roman"/>
+                <w:sz w:val="24"/>
+                <w:szCs w:val="24"/>
+                <w:lang w:val="es-MX"/>
+              </w:rPr>
+              <w:t>Carrera 20Troncal de Occidente</w:t>
+            </w:r>
           </w:p>
         </w:tc>
         <w:tc>
@@ -2750,6 +2768,15 @@
                 <w:lang w:val="es-MX"/>
               </w:rPr>
             </w:pPr>
+            <w:r>
+              <w:rPr>
+                <w:rFonts w:ascii="Times New Roman" w:hAnsi="Times New Roman" w:cs="Times New Roman"/>
+                <w:sz w:val="24"/>
+                <w:szCs w:val="24"/>
+                <w:lang w:val="es-MX"/>
+              </w:rPr>
+              <w:t>811018448-7</w:t>
+            </w:r>
           </w:p>
         </w:tc>
       </w:tr>
@@ -2987,6 +3014,16 @@
                 <w:lang w:val="es-MX"/>
               </w:rPr>
             </w:pPr>
+            <w:r>
+              <w:rPr>
+                <w:rFonts w:ascii="Times New Roman" w:hAnsi="Times New Roman" w:cs="Times New Roman"/>
+                <w:color w:val="FF0000"/>
+                <w:sz w:val="24"/>
+                <w:szCs w:val="24"/>
+                <w:lang w:val="es-MX"/>
+              </w:rPr>
+              <w:t>José Pío Viloria Luna</w:t>
+            </w:r>
           </w:p>
         </w:tc>
         <w:tc>
@@ -3004,6 +3041,15 @@
                 <w:lang w:val="es-MX"/>
               </w:rPr>
             </w:pPr>
+            <w:r>
+              <w:rPr>
+                <w:rFonts w:ascii="Times New Roman" w:hAnsi="Times New Roman" w:cs="Times New Roman"/>
+                <w:sz w:val="24"/>
+                <w:szCs w:val="24"/>
+                <w:lang w:val="es-MX"/>
+              </w:rPr>
+              <w:t>3217185366</w:t>
+            </w:r>
           </w:p>
         </w:tc>
         <w:tc>
@@ -3021,6 +3067,15 @@
                 <w:lang w:val="es-MX"/>
               </w:rPr>
             </w:pPr>
+            <w:r>
+              <w:rPr>
+                <w:rFonts w:ascii="Times New Roman" w:hAnsi="Times New Roman" w:cs="Times New Roman"/>
+                <w:sz w:val="24"/>
+                <w:szCs w:val="24"/>
+                <w:lang w:val="es-MX"/>
+              </w:rPr>
+              <w:t>I.E. Liceo Caucasia</w:t>
+            </w:r>
           </w:p>
         </w:tc>
         <w:tc>
@@ -3038,6 +3093,15 @@
                 <w:lang w:val="es-MX"/>
               </w:rPr>
             </w:pPr>
+            <w:r>
+              <w:rPr>
+                <w:rFonts w:ascii="Times New Roman" w:hAnsi="Times New Roman" w:cs="Times New Roman"/>
+                <w:sz w:val="24"/>
+                <w:szCs w:val="24"/>
+                <w:lang w:val="es-MX"/>
+              </w:rPr>
+              <w:t>Vilorialuna16@gmail.com</w:t>
+            </w:r>
           </w:p>
         </w:tc>
       </w:tr>
@@ -3472,6 +3536,68 @@
           <w:rFonts w:ascii="Times New Roman" w:hAnsi="Times New Roman" w:cs="Times New Roman"/>
         </w:rPr>
       </w:pPr>
+      <w:r>
+        <w:rPr>
+          <w:rFonts w:ascii="Times New Roman" w:hAnsi="Times New Roman" w:cs="Times New Roman"/>
+        </w:rPr>
+        <w:drawing>
+          <wp:inline distT="0" distB="0" distL="0" distR="0" wp14:anchorId="397B21DE" wp14:editId="06FB207E">
+            <wp:extent cx="3670300" cy="781950"/>
+            <wp:effectExtent l="0" t="0" r="6350" b="0"/>
+            <wp:docPr id="432339399" name="Imagen 2"/>
+            <wp:cNvGraphicFramePr>
+              <a:graphicFrameLocks xmlns:a="http://schemas.openxmlformats.org/drawingml/2006/main" noChangeAspect="1"/>
+            </wp:cNvGraphicFramePr>
+            <a:graphic xmlns:a="http://schemas.openxmlformats.org/drawingml/2006/main">
+              <a:graphicData uri="http://schemas.openxmlformats.org/drawingml/2006/picture">
+                <pic:pic xmlns:pic="http://schemas.openxmlformats.org/drawingml/2006/picture">
+                  <pic:nvPicPr>
+                    <pic:cNvPr id="0" name="Picture 6"/>
+                    <pic:cNvPicPr>
+                      <a:picLocks noChangeAspect="1" noChangeArrowheads="1"/>
+                    </pic:cNvPicPr>
+                  </pic:nvPicPr>
+                  <pic:blipFill>
+                    <a:blip r:embed="rId9">
+                      <a:extLst>
+                        <a:ext uri="{28A0092B-C50C-407E-A947-70E740481C1C}">
+                          <a14:useLocalDpi xmlns:a14="http://schemas.microsoft.com/office/drawing/2010/main" val="0"/>
+                        </a:ext>
+                      </a:extLst>
+                    </a:blip>
+                    <a:srcRect/>
+                    <a:stretch>
+                      <a:fillRect/>
+                    </a:stretch>
+                  </pic:blipFill>
+                  <pic:spPr bwMode="auto">
+                    <a:xfrm>
+                      <a:off x="0" y="0"/>
+                      <a:ext cx="3788229" cy="807075"/>
+                    </a:xfrm>
+                    <a:prstGeom prst="rect">
+                      <a:avLst/>
+                    </a:prstGeom>
+                    <a:noFill/>
+                    <a:ln>
+                      <a:noFill/>
+                    </a:ln>
+                  </pic:spPr>
+                </pic:pic>
+              </a:graphicData>
+            </a:graphic>
+          </wp:inline>
+        </w:drawing>
+      </w:r>
+    </w:p>
+    <w:p>
+      <w:pPr>
+        <w:spacing w:after="0" w:line="240" w:lineRule="auto"/>
+        <w:jc w:val="both"/>
+        <w:rPr>
+          <w:rFonts w:ascii="Times New Roman" w:hAnsi="Times New Roman" w:cs="Times New Roman"/>
+        </w:rPr>
+      </w:pPr>
     </w:p>
     <w:p>
       <w:pPr>
@@ -3608,7 +3734,7 @@
         </w:rPr>
         <w:t xml:space="preserve">Contacto: </w:t>
       </w:r>
-      <w:hyperlink r:id="rId9" w:history="1">
+      <w:hyperlink r:id="rId10" w:history="1">
         <w:r>
           <w:rPr>
             <w:rStyle w:val="Hipervnculo"/>
@@ -3774,10 +3900,10 @@
       </w:r>
     </w:p>
     <w:sectPr>
-      <w:headerReference w:type="even" r:id="rId10"/>
-      <w:headerReference w:type="default" r:id="rId11"/>
-      <w:footerReference w:type="default" r:id="rId12"/>
-      <w:headerReference w:type="first" r:id="rId13"/>
+      <w:headerReference w:type="even" r:id="rId11"/>
+      <w:headerReference w:type="default" r:id="rId12"/>
+      <w:footerReference w:type="default" r:id="rId13"/>
+      <w:headerReference w:type="first" r:id="rId14"/>
       <w:pgSz w:w="12240" w:h="15840"/>
       <w:pgMar w:top="1134" w:right="1701" w:bottom="1418" w:left="1560" w:header="709" w:footer="709" w:gutter="0"/>
       <w:cols w:space="708"/>
@@ -4695,7 +4821,6 @@
   <w:style w:type="character" w:default="1" w:styleId="Fuentedeprrafopredeter">
     <w:name w:val="Default Paragraph Font"/>
     <w:uiPriority w:val="1"/>
-    <w:semiHidden/>
     <w:unhideWhenUsed/>
   </w:style>
   <w:style w:type="table" w:default="1" w:styleId="Tablanormal">
@@ -5299,6 +5424,10 @@
 </file>
 
 <file path=customXml/item1.xml><?xml version="1.0" encoding="utf-8"?>
+<b:Sources xmlns:b="http://schemas.openxmlformats.org/officeDocument/2006/bibliography" xmlns="http://schemas.openxmlformats.org/officeDocument/2006/bibliography" SelectedStyle="/APA.XSL" StyleName="APA"/>
+</file>
+
+<file path=customXml/item2.xml><?xml version="1.0" encoding="utf-8"?>
 <s:customData xmlns="http://www.wps.cn/officeDocument/2013/wpsCustomData" xmlns:s="http://www.wps.cn/officeDocument/2013/wpsCustomData">
   <customSectProps/>
   <customShpExts>
@@ -5308,22 +5437,18 @@
 </s:customData>
 </file>
 
-<file path=customXml/item2.xml><?xml version="1.0" encoding="utf-8"?>
-<b:Sources xmlns:b="http://schemas.openxmlformats.org/officeDocument/2006/bibliography" xmlns="http://schemas.openxmlformats.org/officeDocument/2006/bibliography" SelectedStyle="/APA.XSL" StyleName="APA"/>
+<file path=customXml/itemProps1.xml><?xml version="1.0" encoding="utf-8"?>
+<ds:datastoreItem xmlns:ds="http://schemas.openxmlformats.org/officeDocument/2006/customXml" ds:itemID="{2D82C844-1AE0-44AC-90E9-92968CB8230D}">
+  <ds:schemaRefs>
+    <ds:schemaRef ds:uri="http://schemas.openxmlformats.org/officeDocument/2006/bibliography"/>
+  </ds:schemaRefs>
+</ds:datastoreItem>
 </file>
 
-<file path=customXml/itemProps1.xml><?xml version="1.0" encoding="utf-8"?>
+<file path=customXml/itemProps2.xml><?xml version="1.0" encoding="utf-8"?>
 <ds:datastoreItem xmlns:ds="http://schemas.openxmlformats.org/officeDocument/2006/customXml" ds:itemID="{B1977F7D-205B-4081-913C-38D41E755F92}">
   <ds:schemaRefs>
     <ds:schemaRef ds:uri="http://www.wps.cn/officeDocument/2013/wpsCustomData"/>
   </ds:schemaRefs>
 </ds:datastoreItem>
-</file>
-
-<file path=customXml/itemProps2.xml><?xml version="1.0" encoding="utf-8"?>
-<ds:datastoreItem xmlns:ds="http://schemas.openxmlformats.org/officeDocument/2006/customXml" ds:itemID="{2D82C844-1AE0-44AC-90E9-92968CB8230D}">
-  <ds:schemaRefs>
-    <ds:schemaRef ds:uri="http://schemas.openxmlformats.org/officeDocument/2006/bibliography"/>
-  </ds:schemaRefs>
-</ds:datastoreItem>
 </file>
</xml_diff>